<commit_message>
Final polish: verified claims, presentation script, all documents rebuilt
Every [[VERIFY]] tag in the deck resolved against the published papers
(Magesh et al., JELS 2025; IL-TUR and ILSIC tables) or replaced with
neutral wording. A false claim about AALAP's AIBE score (it scored above
its base model, 25.56% vs 23.48%, both failing) is corrected in the
synopsis, guide and CLAUDE.md. New presentation script (timing, click
cues, demo runbook, fallbacks, Q&A). Deck passes an overflow audit in
both themes. Report, synopsis, paper, guide and deck PDFs rebuilt;
422 tests, API smoke test and UI click-through pass.

Co-Authored-By: Claude Opus 5.5 <noreply@anthropic.com>
</commit_message>
<xml_diff>
--- a/stuff/docs/report/Pramana_Report.docx
+++ b/stuff/docs/report/Pramana_Report.docx
@@ -209,7 +209,7 @@
           <w:noProof/>
         </w:rPr>
         <w:drawing>
-          <wp:inline distT="0" distB="0" distL="0" distR="0" wp14:anchorId="72D2724E" wp14:editId="0E781047">
+          <wp:inline distT="0" distB="0" distL="0" distR="0" wp14:anchorId="28C9DD34" wp14:editId="6337E017">
             <wp:extent cx="1428750" cy="1638300"/>
             <wp:effectExtent l="0" t="0" r="0" b="0"/>
             <wp:docPr id="1" name="Picture 1"/>
@@ -456,15 +456,6 @@
     </w:p>
     <w:p>
       <w:pPr>
-        <w:spacing w:after="40" w:line="300" w:lineRule="auto"/>
-        <w:jc w:val="both"/>
-      </w:pPr>
-      <w:r>
-        <w:t>[Designation]</w:t>
-      </w:r>
-    </w:p>
-    <w:p>
-      <w:pPr>
         <w:spacing w:after="200" w:line="300" w:lineRule="auto"/>
         <w:jc w:val="both"/>
       </w:pPr>
@@ -4206,7 +4197,7 @@
           <w:b/>
           <w:bCs/>
         </w:rPr>
-        <w:t>Magesh et al. (2024):</w:t>
+        <w:t>Magesh et al. (Journal of Empirical Legal Studies, 2025):</w:t>
       </w:r>
       <w:r>
         <w:t xml:space="preserve"> found that commercial RAG-based legal research tools still hallucinate on a substantial share of queries.</w:t>
@@ -4897,10 +4888,10 @@
           <w:noProof/>
         </w:rPr>
         <w:drawing>
-          <wp:inline distT="0" distB="0" distL="0" distR="0" wp14:anchorId="2F1523AC" wp14:editId="590659F2">
+          <wp:inline distT="0" distB="0" distL="0" distR="0" wp14:anchorId="719CC824" wp14:editId="26B6FB99">
             <wp:extent cx="5619750" cy="3171825"/>
             <wp:effectExtent l="0" t="0" r="0" b="0"/>
-            <wp:docPr id="1099317641" name="Picture 1099317641"/>
+            <wp:docPr id="197089613" name="Picture 197089613"/>
             <wp:cNvGraphicFramePr>
               <a:graphicFrameLocks xmlns:a="http://schemas.openxmlformats.org/drawingml/2006/main" noChangeAspect="1"/>
             </wp:cNvGraphicFramePr>
@@ -7836,10 +7827,10 @@
           <w:noProof/>
         </w:rPr>
         <w:drawing>
-          <wp:inline distT="0" distB="0" distL="0" distR="0" wp14:anchorId="63B5784C" wp14:editId="43D4DE37">
+          <wp:inline distT="0" distB="0" distL="0" distR="0" wp14:anchorId="54DEF36C" wp14:editId="082D6415">
             <wp:extent cx="5334000" cy="2295525"/>
             <wp:effectExtent l="0" t="0" r="0" b="0"/>
-            <wp:docPr id="345935757" name="Picture 345935757"/>
+            <wp:docPr id="728219390" name="Picture 728219390"/>
             <wp:cNvGraphicFramePr>
               <a:graphicFrameLocks xmlns:a="http://schemas.openxmlformats.org/drawingml/2006/main" noChangeAspect="1"/>
             </wp:cNvGraphicFramePr>
@@ -8798,10 +8789,10 @@
           <w:noProof/>
         </w:rPr>
         <w:drawing>
-          <wp:inline distT="0" distB="0" distL="0" distR="0" wp14:anchorId="585DBF51" wp14:editId="1F817060">
+          <wp:inline distT="0" distB="0" distL="0" distR="0" wp14:anchorId="5065380B" wp14:editId="5623E399">
             <wp:extent cx="5334000" cy="2019300"/>
             <wp:effectExtent l="0" t="0" r="0" b="0"/>
-            <wp:docPr id="1625723815" name="Picture 1625723815"/>
+            <wp:docPr id="980816731" name="Picture 980816731"/>
             <wp:cNvGraphicFramePr>
               <a:graphicFrameLocks xmlns:a="http://schemas.openxmlformats.org/drawingml/2006/main" noChangeAspect="1"/>
             </wp:cNvGraphicFramePr>
@@ -8885,10 +8876,10 @@
           <w:noProof/>
         </w:rPr>
         <w:drawing>
-          <wp:inline distT="0" distB="0" distL="0" distR="0" wp14:anchorId="43C0E692" wp14:editId="5A5A44C1">
+          <wp:inline distT="0" distB="0" distL="0" distR="0" wp14:anchorId="39DF4A1C" wp14:editId="462AF2BB">
             <wp:extent cx="5524500" cy="3314700"/>
             <wp:effectExtent l="0" t="0" r="0" b="0"/>
-            <wp:docPr id="1132301929" name="Picture 1132301929"/>
+            <wp:docPr id="1854664693" name="Picture 1854664693"/>
             <wp:cNvGraphicFramePr>
               <a:graphicFrameLocks xmlns:a="http://schemas.openxmlformats.org/drawingml/2006/main" noChangeAspect="1"/>
             </wp:cNvGraphicFramePr>
@@ -9127,10 +9118,10 @@
           <w:noProof/>
         </w:rPr>
         <w:drawing>
-          <wp:inline distT="0" distB="0" distL="0" distR="0" wp14:anchorId="540C9886" wp14:editId="0244228D">
+          <wp:inline distT="0" distB="0" distL="0" distR="0" wp14:anchorId="78AED29C" wp14:editId="65D2B357">
             <wp:extent cx="5143500" cy="3448050"/>
             <wp:effectExtent l="0" t="0" r="0" b="0"/>
-            <wp:docPr id="1582588025" name="Picture 1582588025"/>
+            <wp:docPr id="2040712798" name="Picture 2040712798"/>
             <wp:cNvGraphicFramePr>
               <a:graphicFrameLocks xmlns:a="http://schemas.openxmlformats.org/drawingml/2006/main" noChangeAspect="1"/>
             </wp:cNvGraphicFramePr>
@@ -10957,10 +10948,10 @@
           <w:noProof/>
         </w:rPr>
         <w:drawing>
-          <wp:inline distT="0" distB="0" distL="0" distR="0" wp14:anchorId="0AEE34D9" wp14:editId="6F6E1018">
+          <wp:inline distT="0" distB="0" distL="0" distR="0" wp14:anchorId="5F36F66E" wp14:editId="5A98D464">
             <wp:extent cx="5334000" cy="3000375"/>
             <wp:effectExtent l="0" t="0" r="0" b="0"/>
-            <wp:docPr id="700432962" name="Picture 700432962"/>
+            <wp:docPr id="1151398726" name="Picture 1151398726"/>
             <wp:cNvGraphicFramePr>
               <a:graphicFrameLocks xmlns:a="http://schemas.openxmlformats.org/drawingml/2006/main" noChangeAspect="1"/>
             </wp:cNvGraphicFramePr>
@@ -11023,10 +11014,10 @@
         </w:rPr>
         <w:lastRenderedPageBreak/>
         <w:drawing>
-          <wp:inline distT="0" distB="0" distL="0" distR="0" wp14:anchorId="6C6C6071" wp14:editId="14BCCA29">
+          <wp:inline distT="0" distB="0" distL="0" distR="0" wp14:anchorId="3418F8E4" wp14:editId="3D110045">
             <wp:extent cx="5334000" cy="3000375"/>
             <wp:effectExtent l="0" t="0" r="0" b="0"/>
-            <wp:docPr id="866021577" name="Picture 866021577"/>
+            <wp:docPr id="378856761" name="Picture 378856761"/>
             <wp:cNvGraphicFramePr>
               <a:graphicFrameLocks xmlns:a="http://schemas.openxmlformats.org/drawingml/2006/main" noChangeAspect="1"/>
             </wp:cNvGraphicFramePr>
@@ -13603,10 +13594,10 @@
         </w:rPr>
         <w:lastRenderedPageBreak/>
         <w:drawing>
-          <wp:inline distT="0" distB="0" distL="0" distR="0" wp14:anchorId="29A44B28" wp14:editId="1EE40338">
+          <wp:inline distT="0" distB="0" distL="0" distR="0" wp14:anchorId="50442ECF" wp14:editId="62C48993">
             <wp:extent cx="5334000" cy="3000375"/>
             <wp:effectExtent l="0" t="0" r="0" b="0"/>
-            <wp:docPr id="1363201374" name="Picture 1363201374"/>
+            <wp:docPr id="577347479" name="Picture 577347479"/>
             <wp:cNvGraphicFramePr>
               <a:graphicFrameLocks xmlns:a="http://schemas.openxmlformats.org/drawingml/2006/main" noChangeAspect="1"/>
             </wp:cNvGraphicFramePr>
@@ -13668,10 +13659,10 @@
           <w:noProof/>
         </w:rPr>
         <w:drawing>
-          <wp:inline distT="0" distB="0" distL="0" distR="0" wp14:anchorId="2C5C2BF9" wp14:editId="670FC4E0">
+          <wp:inline distT="0" distB="0" distL="0" distR="0" wp14:anchorId="28DEA618" wp14:editId="0096AA75">
             <wp:extent cx="5334000" cy="3000375"/>
             <wp:effectExtent l="0" t="0" r="0" b="0"/>
-            <wp:docPr id="247467031" name="Picture 247467031"/>
+            <wp:docPr id="300764154" name="Picture 300764154"/>
             <wp:cNvGraphicFramePr>
               <a:graphicFrameLocks xmlns:a="http://schemas.openxmlformats.org/drawingml/2006/main" noChangeAspect="1"/>
             </wp:cNvGraphicFramePr>
@@ -14333,7 +14324,7 @@
           <w:sz w:val="23"/>
           <w:szCs w:val="23"/>
         </w:rPr>
-        <w:t>V. Magesh, F. Surani, M. Dahl, M. Suzgun, C. D. Manning and D. E. Ho, “Hallucination-free? Assessing the reliability of leading AI legal research tools,” arXiv:2405.20362, 2024.</w:t>
+        <w:t>V. Magesh, F. Surani, M. Dahl, M. Suzgun, C. D. Manning and D. E. Ho, “Hallucination-free? Assessing the reliability of leading AI legal research tools,” Journal of Empirical Legal Studies, 2025 (arXiv:2405.20362).</w:t>
       </w:r>
     </w:p>
     <w:p>
@@ -14479,208 +14470,208 @@
 <file path=word/numbering.xml><?xml version="1.0" encoding="utf-8"?>
 <w:numbering xmlns:wpc="http://schemas.microsoft.com/office/word/2010/wordprocessingCanvas" xmlns:cx="http://schemas.microsoft.com/office/drawing/2014/chartex" xmlns:cx1="http://schemas.microsoft.com/office/drawing/2015/9/8/chartex" xmlns:cx2="http://schemas.microsoft.com/office/drawing/2015/10/21/chartex" xmlns:cx3="http://schemas.microsoft.com/office/drawing/2016/5/9/chartex" xmlns:cx4="http://schemas.microsoft.com/office/drawing/2016/5/10/chartex" xmlns:cx5="http://schemas.microsoft.com/office/drawing/2016/5/11/chartex" xmlns:cx6="http://schemas.microsoft.com/office/drawing/2016/5/12/chartex" xmlns:cx7="http://schemas.microsoft.com/office/drawing/2016/5/13/chartex" xmlns:cx8="http://schemas.microsoft.com/office/drawing/2016/5/14/chartex" xmlns:mc="http://schemas.openxmlformats.org/markup-compatibility/2006" xmlns:aink="http://schemas.microsoft.com/office/drawing/2016/ink" xmlns:am3d="http://schemas.microsoft.com/office/drawing/2017/model3d" xmlns:o="urn:schemas-microsoft-com:office:office" xmlns:oel="http://schemas.microsoft.com/office/2019/extlst" xmlns:r="http://schemas.openxmlformats.org/officeDocument/2006/relationships" xmlns:m="http://schemas.openxmlformats.org/officeDocument/2006/math" xmlns:v="urn:schemas-microsoft-com:vml" xmlns:wp14="http://schemas.microsoft.com/office/word/2010/wordprocessingDrawing" xmlns:wp="http://schemas.openxmlformats.org/drawingml/2006/wordprocessingDrawing" xmlns:w10="urn:schemas-microsoft-com:office:word" xmlns:w="http://schemas.openxmlformats.org/wordprocessingml/2006/main" xmlns:w14="http://schemas.microsoft.com/office/word/2010/wordml" xmlns:w15="http://schemas.microsoft.com/office/word/2012/wordml" xmlns:w16cex="http://schemas.microsoft.com/office/word/2018/wordml/cex" xmlns:w16cid="http://schemas.microsoft.com/office/word/2016/wordml/cid" xmlns:w16="http://schemas.microsoft.com/office/word/2018/wordml" xmlns:w16du="http://schemas.microsoft.com/office/word/2023/wordml/word16du" xmlns:w16sdtdh="http://schemas.microsoft.com/office/word/2020/wordml/sdtdatahash" xmlns:w16sdtfl="http://schemas.microsoft.com/office/word/2024/wordml/sdtformatlock" xmlns:w16se="http://schemas.microsoft.com/office/word/2015/wordml/symex" xmlns:wpg="http://schemas.microsoft.com/office/word/2010/wordprocessingGroup" xmlns:wpi="http://schemas.microsoft.com/office/word/2010/wordprocessingInk" xmlns:wne="http://schemas.microsoft.com/office/word/2006/wordml" xmlns:wps="http://schemas.microsoft.com/office/word/2010/wordprocessingShape" mc:Ignorable="w14 w15 w16se w16cid w16 w16cex w16sdtdh w16sdtfl w16du wp14">
   <w:abstractNum w:abstractNumId="0" w15:restartNumberingAfterBreak="0">
-    <w:nsid w:val="27D55D43"/>
+    <w:nsid w:val="328C55B7"/>
     <w:multiLevelType w:val="hybridMultilevel"/>
-    <w:tmpl w:val="29F64D7C"/>
-    <w:lvl w:ilvl="0" w:tplc="DE6EADA4">
+    <w:tmpl w:val="9C04DC66"/>
+    <w:lvl w:ilvl="0" w:tplc="F92824CC">
       <w:start w:val="1"/>
       <w:numFmt w:val="bullet"/>
-      <w:lvlText w:val="•"/>
+      <w:lvlText w:val="●"/>
       <w:lvlJc w:val="left"/>
       <w:pPr>
         <w:ind w:left="720" w:hanging="360"/>
       </w:pPr>
     </w:lvl>
-    <w:lvl w:ilvl="1" w:tplc="EABE2928">
+    <w:lvl w:ilvl="1" w:tplc="2160E200">
       <w:start w:val="1"/>
       <w:numFmt w:val="bullet"/>
-      <w:lvlText w:val="◦"/>
+      <w:lvlText w:val="○"/>
       <w:lvlJc w:val="left"/>
       <w:pPr>
         <w:ind w:left="1440" w:hanging="360"/>
       </w:pPr>
     </w:lvl>
-    <w:lvl w:ilvl="2" w:tplc="33187A26">
+    <w:lvl w:ilvl="2" w:tplc="BCBCF22E">
+      <w:start w:val="1"/>
+      <w:numFmt w:val="bullet"/>
+      <w:lvlText w:val="■"/>
+      <w:lvlJc w:val="left"/>
+      <w:pPr>
+        <w:ind w:left="2160" w:hanging="360"/>
+      </w:pPr>
+    </w:lvl>
+    <w:lvl w:ilvl="3" w:tplc="815AE254">
+      <w:start w:val="1"/>
+      <w:numFmt w:val="bullet"/>
+      <w:lvlText w:val="●"/>
+      <w:lvlJc w:val="left"/>
+      <w:pPr>
+        <w:ind w:left="2880" w:hanging="360"/>
+      </w:pPr>
+    </w:lvl>
+    <w:lvl w:ilvl="4" w:tplc="499E8CA6">
+      <w:start w:val="1"/>
+      <w:numFmt w:val="bullet"/>
+      <w:lvlText w:val="○"/>
+      <w:lvlJc w:val="left"/>
+      <w:pPr>
+        <w:ind w:left="3600" w:hanging="360"/>
+      </w:pPr>
+    </w:lvl>
+    <w:lvl w:ilvl="5" w:tplc="47C23AE4">
+      <w:start w:val="1"/>
+      <w:numFmt w:val="bullet"/>
+      <w:lvlText w:val="■"/>
+      <w:lvlJc w:val="left"/>
+      <w:pPr>
+        <w:ind w:left="4320" w:hanging="360"/>
+      </w:pPr>
+    </w:lvl>
+    <w:lvl w:ilvl="6" w:tplc="B47CB000">
+      <w:start w:val="1"/>
+      <w:numFmt w:val="bullet"/>
+      <w:lvlText w:val="●"/>
+      <w:lvlJc w:val="left"/>
+      <w:pPr>
+        <w:ind w:left="5040" w:hanging="360"/>
+      </w:pPr>
+    </w:lvl>
+    <w:lvl w:ilvl="7" w:tplc="86F4C89C">
+      <w:start w:val="1"/>
+      <w:numFmt w:val="bullet"/>
+      <w:lvlText w:val="●"/>
+      <w:lvlJc w:val="left"/>
+      <w:pPr>
+        <w:ind w:left="5760" w:hanging="360"/>
+      </w:pPr>
+    </w:lvl>
+    <w:lvl w:ilvl="8" w:tplc="C0342BBE">
+      <w:start w:val="1"/>
+      <w:numFmt w:val="bullet"/>
+      <w:lvlText w:val="●"/>
+      <w:lvlJc w:val="left"/>
+      <w:pPr>
+        <w:ind w:left="6480" w:hanging="360"/>
+      </w:pPr>
+    </w:lvl>
+  </w:abstractNum>
+  <w:abstractNum w:abstractNumId="1" w15:restartNumberingAfterBreak="0">
+    <w:nsid w:val="345568DE"/>
+    <w:multiLevelType w:val="hybridMultilevel"/>
+    <w:tmpl w:val="92903E08"/>
+    <w:lvl w:ilvl="0" w:tplc="43CA13B0">
+      <w:start w:val="1"/>
+      <w:numFmt w:val="decimal"/>
+      <w:lvlText w:val="%1."/>
+      <w:lvlJc w:val="left"/>
+      <w:pPr>
+        <w:ind w:left="720" w:hanging="400"/>
+      </w:pPr>
+    </w:lvl>
+    <w:lvl w:ilvl="1" w:tplc="AE823198">
       <w:numFmt w:val="decimal"/>
       <w:lvlText w:val=""/>
       <w:lvlJc w:val="left"/>
     </w:lvl>
-    <w:lvl w:ilvl="3" w:tplc="9BDCAF5A">
+    <w:lvl w:ilvl="2" w:tplc="FF3C48E6">
       <w:numFmt w:val="decimal"/>
       <w:lvlText w:val=""/>
       <w:lvlJc w:val="left"/>
     </w:lvl>
-    <w:lvl w:ilvl="4" w:tplc="A1F4BADE">
+    <w:lvl w:ilvl="3" w:tplc="F2F66574">
       <w:numFmt w:val="decimal"/>
       <w:lvlText w:val=""/>
       <w:lvlJc w:val="left"/>
     </w:lvl>
-    <w:lvl w:ilvl="5" w:tplc="608A2DD2">
+    <w:lvl w:ilvl="4" w:tplc="9AF42458">
       <w:numFmt w:val="decimal"/>
       <w:lvlText w:val=""/>
       <w:lvlJc w:val="left"/>
     </w:lvl>
-    <w:lvl w:ilvl="6" w:tplc="3C284B5C">
+    <w:lvl w:ilvl="5" w:tplc="A0FC5192">
       <w:numFmt w:val="decimal"/>
       <w:lvlText w:val=""/>
       <w:lvlJc w:val="left"/>
     </w:lvl>
-    <w:lvl w:ilvl="7" w:tplc="8FCCF5D8">
+    <w:lvl w:ilvl="6" w:tplc="A4863202">
       <w:numFmt w:val="decimal"/>
       <w:lvlText w:val=""/>
       <w:lvlJc w:val="left"/>
     </w:lvl>
-    <w:lvl w:ilvl="8" w:tplc="E3664DC6">
+    <w:lvl w:ilvl="7" w:tplc="D26ACB42">
+      <w:numFmt w:val="decimal"/>
+      <w:lvlText w:val=""/>
+      <w:lvlJc w:val="left"/>
+    </w:lvl>
+    <w:lvl w:ilvl="8" w:tplc="389AF8DC">
       <w:numFmt w:val="decimal"/>
       <w:lvlText w:val=""/>
       <w:lvlJc w:val="left"/>
     </w:lvl>
   </w:abstractNum>
-  <w:abstractNum w:abstractNumId="1" w15:restartNumberingAfterBreak="0">
-    <w:nsid w:val="4886765B"/>
+  <w:abstractNum w:abstractNumId="2" w15:restartNumberingAfterBreak="0">
+    <w:nsid w:val="3A1E5114"/>
     <w:multiLevelType w:val="hybridMultilevel"/>
-    <w:tmpl w:val="99A4B1CC"/>
-    <w:lvl w:ilvl="0" w:tplc="80DAB3EE">
+    <w:tmpl w:val="79CC12E0"/>
+    <w:lvl w:ilvl="0" w:tplc="6B0634C6">
       <w:start w:val="1"/>
       <w:numFmt w:val="bullet"/>
-      <w:lvlText w:val="●"/>
+      <w:lvlText w:val="•"/>
       <w:lvlJc w:val="left"/>
       <w:pPr>
         <w:ind w:left="720" w:hanging="360"/>
       </w:pPr>
     </w:lvl>
-    <w:lvl w:ilvl="1" w:tplc="50508882">
+    <w:lvl w:ilvl="1" w:tplc="214E2D16">
       <w:start w:val="1"/>
       <w:numFmt w:val="bullet"/>
-      <w:lvlText w:val="○"/>
+      <w:lvlText w:val="◦"/>
       <w:lvlJc w:val="left"/>
       <w:pPr>
         <w:ind w:left="1440" w:hanging="360"/>
       </w:pPr>
     </w:lvl>
-    <w:lvl w:ilvl="2" w:tplc="688C50E6">
-      <w:start w:val="1"/>
-      <w:numFmt w:val="bullet"/>
-      <w:lvlText w:val="■"/>
-      <w:lvlJc w:val="left"/>
-      <w:pPr>
-        <w:ind w:left="2160" w:hanging="360"/>
-      </w:pPr>
-    </w:lvl>
-    <w:lvl w:ilvl="3" w:tplc="040454F4">
-      <w:start w:val="1"/>
-      <w:numFmt w:val="bullet"/>
-      <w:lvlText w:val="●"/>
-      <w:lvlJc w:val="left"/>
-      <w:pPr>
-        <w:ind w:left="2880" w:hanging="360"/>
-      </w:pPr>
-    </w:lvl>
-    <w:lvl w:ilvl="4" w:tplc="739A4312">
-      <w:start w:val="1"/>
-      <w:numFmt w:val="bullet"/>
-      <w:lvlText w:val="○"/>
-      <w:lvlJc w:val="left"/>
-      <w:pPr>
-        <w:ind w:left="3600" w:hanging="360"/>
-      </w:pPr>
-    </w:lvl>
-    <w:lvl w:ilvl="5" w:tplc="8C1CB502">
-      <w:start w:val="1"/>
-      <w:numFmt w:val="bullet"/>
-      <w:lvlText w:val="■"/>
-      <w:lvlJc w:val="left"/>
-      <w:pPr>
-        <w:ind w:left="4320" w:hanging="360"/>
-      </w:pPr>
-    </w:lvl>
-    <w:lvl w:ilvl="6" w:tplc="A6603FDA">
-      <w:start w:val="1"/>
-      <w:numFmt w:val="bullet"/>
-      <w:lvlText w:val="●"/>
-      <w:lvlJc w:val="left"/>
-      <w:pPr>
-        <w:ind w:left="5040" w:hanging="360"/>
-      </w:pPr>
-    </w:lvl>
-    <w:lvl w:ilvl="7" w:tplc="0A00116A">
-      <w:start w:val="1"/>
-      <w:numFmt w:val="bullet"/>
-      <w:lvlText w:val="●"/>
-      <w:lvlJc w:val="left"/>
-      <w:pPr>
-        <w:ind w:left="5760" w:hanging="360"/>
-      </w:pPr>
-    </w:lvl>
-    <w:lvl w:ilvl="8" w:tplc="7EA28096">
-      <w:start w:val="1"/>
-      <w:numFmt w:val="bullet"/>
-      <w:lvlText w:val="●"/>
-      <w:lvlJc w:val="left"/>
-      <w:pPr>
-        <w:ind w:left="6480" w:hanging="360"/>
-      </w:pPr>
-    </w:lvl>
-  </w:abstractNum>
-  <w:abstractNum w:abstractNumId="2" w15:restartNumberingAfterBreak="0">
-    <w:nsid w:val="4D736FF0"/>
-    <w:multiLevelType w:val="hybridMultilevel"/>
-    <w:tmpl w:val="1E921CF2"/>
-    <w:lvl w:ilvl="0" w:tplc="E228D392">
-      <w:start w:val="1"/>
-      <w:numFmt w:val="decimal"/>
-      <w:lvlText w:val="%1."/>
-      <w:lvlJc w:val="left"/>
-      <w:pPr>
-        <w:ind w:left="720" w:hanging="400"/>
-      </w:pPr>
-    </w:lvl>
-    <w:lvl w:ilvl="1" w:tplc="33EC7526">
+    <w:lvl w:ilvl="2" w:tplc="16C2981C">
       <w:numFmt w:val="decimal"/>
       <w:lvlText w:val=""/>
       <w:lvlJc w:val="left"/>
     </w:lvl>
-    <w:lvl w:ilvl="2" w:tplc="A096088E">
+    <w:lvl w:ilvl="3" w:tplc="D814167E">
       <w:numFmt w:val="decimal"/>
       <w:lvlText w:val=""/>
       <w:lvlJc w:val="left"/>
     </w:lvl>
-    <w:lvl w:ilvl="3" w:tplc="73E8F072">
+    <w:lvl w:ilvl="4" w:tplc="4304681E">
       <w:numFmt w:val="decimal"/>
       <w:lvlText w:val=""/>
       <w:lvlJc w:val="left"/>
     </w:lvl>
-    <w:lvl w:ilvl="4" w:tplc="C7AA3E4C">
+    <w:lvl w:ilvl="5" w:tplc="D062ED52">
       <w:numFmt w:val="decimal"/>
       <w:lvlText w:val=""/>
       <w:lvlJc w:val="left"/>
     </w:lvl>
-    <w:lvl w:ilvl="5" w:tplc="383EED4A">
+    <w:lvl w:ilvl="6" w:tplc="28A6DAFA">
       <w:numFmt w:val="decimal"/>
       <w:lvlText w:val=""/>
       <w:lvlJc w:val="left"/>
     </w:lvl>
-    <w:lvl w:ilvl="6" w:tplc="BE067890">
+    <w:lvl w:ilvl="7" w:tplc="4EFA5F02">
       <w:numFmt w:val="decimal"/>
       <w:lvlText w:val=""/>
       <w:lvlJc w:val="left"/>
     </w:lvl>
-    <w:lvl w:ilvl="7" w:tplc="A038FA20">
-      <w:numFmt w:val="decimal"/>
-      <w:lvlText w:val=""/>
-      <w:lvlJc w:val="left"/>
-    </w:lvl>
-    <w:lvl w:ilvl="8" w:tplc="69CE7EE6">
+    <w:lvl w:ilvl="8" w:tplc="4FE46B60">
       <w:numFmt w:val="decimal"/>
       <w:lvlText w:val=""/>
       <w:lvlJc w:val="left"/>
     </w:lvl>
   </w:abstractNum>
   <w:abstractNum w:abstractNumId="3" w15:restartNumberingAfterBreak="0">
-    <w:nsid w:val="6C745F26"/>
+    <w:nsid w:val="7AF61272"/>
     <w:multiLevelType w:val="hybridMultilevel"/>
-    <w:tmpl w:val="032C022E"/>
-    <w:lvl w:ilvl="0" w:tplc="ECBEBEF8">
+    <w:tmpl w:val="990E17CE"/>
+    <w:lvl w:ilvl="0" w:tplc="92681420">
       <w:start w:val="1"/>
       <w:numFmt w:val="decimal"/>
       <w:lvlText w:val="%1."/>
@@ -14689,72 +14680,72 @@
         <w:ind w:left="640" w:hanging="460"/>
       </w:pPr>
     </w:lvl>
-    <w:lvl w:ilvl="1" w:tplc="A3687248">
+    <w:lvl w:ilvl="1" w:tplc="8890A3EC">
       <w:numFmt w:val="decimal"/>
       <w:lvlText w:val=""/>
       <w:lvlJc w:val="left"/>
     </w:lvl>
-    <w:lvl w:ilvl="2" w:tplc="C50C04DE">
+    <w:lvl w:ilvl="2" w:tplc="FE302806">
       <w:numFmt w:val="decimal"/>
       <w:lvlText w:val=""/>
       <w:lvlJc w:val="left"/>
     </w:lvl>
-    <w:lvl w:ilvl="3" w:tplc="037AA692">
+    <w:lvl w:ilvl="3" w:tplc="FBC0939C">
       <w:numFmt w:val="decimal"/>
       <w:lvlText w:val=""/>
       <w:lvlJc w:val="left"/>
     </w:lvl>
-    <w:lvl w:ilvl="4" w:tplc="AB10036A">
+    <w:lvl w:ilvl="4" w:tplc="4B765380">
       <w:numFmt w:val="decimal"/>
       <w:lvlText w:val=""/>
       <w:lvlJc w:val="left"/>
     </w:lvl>
-    <w:lvl w:ilvl="5" w:tplc="4440C74E">
+    <w:lvl w:ilvl="5" w:tplc="C4D6EE82">
       <w:numFmt w:val="decimal"/>
       <w:lvlText w:val=""/>
       <w:lvlJc w:val="left"/>
     </w:lvl>
-    <w:lvl w:ilvl="6" w:tplc="AAFE6112">
+    <w:lvl w:ilvl="6" w:tplc="A544B582">
       <w:numFmt w:val="decimal"/>
       <w:lvlText w:val=""/>
       <w:lvlJc w:val="left"/>
     </w:lvl>
-    <w:lvl w:ilvl="7" w:tplc="6758FA1A">
+    <w:lvl w:ilvl="7" w:tplc="E2624CBE">
       <w:numFmt w:val="decimal"/>
       <w:lvlText w:val=""/>
       <w:lvlJc w:val="left"/>
     </w:lvl>
-    <w:lvl w:ilvl="8" w:tplc="791A5734">
+    <w:lvl w:ilvl="8" w:tplc="9BFA48FC">
       <w:numFmt w:val="decimal"/>
       <w:lvlText w:val=""/>
       <w:lvlJc w:val="left"/>
     </w:lvl>
   </w:abstractNum>
-  <w:num w:numId="1" w16cid:durableId="942147567">
+  <w:num w:numId="1" w16cid:durableId="222057983">
+    <w:abstractNumId w:val="0"/>
+    <w:lvlOverride w:ilvl="0">
+      <w:startOverride w:val="1"/>
+    </w:lvlOverride>
+  </w:num>
+  <w:num w:numId="2" w16cid:durableId="840047727">
+    <w:abstractNumId w:val="2"/>
+    <w:lvlOverride w:ilvl="0">
+      <w:startOverride w:val="1"/>
+    </w:lvlOverride>
+  </w:num>
+  <w:num w:numId="3" w16cid:durableId="1917394493">
     <w:abstractNumId w:val="1"/>
     <w:lvlOverride w:ilvl="0">
       <w:startOverride w:val="1"/>
     </w:lvlOverride>
   </w:num>
-  <w:num w:numId="2" w16cid:durableId="488329496">
-    <w:abstractNumId w:val="0"/>
+  <w:num w:numId="4" w16cid:durableId="1046753619">
+    <w:abstractNumId w:val="1"/>
     <w:lvlOverride w:ilvl="0">
       <w:startOverride w:val="1"/>
     </w:lvlOverride>
   </w:num>
-  <w:num w:numId="3" w16cid:durableId="1814985815">
-    <w:abstractNumId w:val="2"/>
-    <w:lvlOverride w:ilvl="0">
-      <w:startOverride w:val="1"/>
-    </w:lvlOverride>
-  </w:num>
-  <w:num w:numId="4" w16cid:durableId="1427916732">
-    <w:abstractNumId w:val="2"/>
-    <w:lvlOverride w:ilvl="0">
-      <w:startOverride w:val="1"/>
-    </w:lvlOverride>
-  </w:num>
-  <w:num w:numId="5" w16cid:durableId="728236547">
+  <w:num w:numId="5" w16cid:durableId="709377645">
     <w:abstractNumId w:val="3"/>
     <w:lvlOverride w:ilvl="0">
       <w:startOverride w:val="1"/>

</xml_diff>